<commit_message>
fix(mcp): repair AIX workflows and verify audit claims
Align MCP adapters with engine APIs, preserve source-aware review and error
contracts, and install client configurations without losing existing settings.
Rebuild the synthetic computed-value fixture and make benchmark verdicts depend
on real protocol, review and output-preservation evidence.

Verified with 528 tests, real Quarto/MCP workflows, minimum-SDK wheel smoke,
four benchmark dimensions and 95 byte-identical reference DOCX parts.

Co-Authored-By: Codex (GPT-5.5) <noreply@openai.com>
</commit_message>
<xml_diff>
--- a/examples/aix-demo/from-coauthors/coauthor-edits.docx
+++ b/examples/aix-demo/from-coauthors/coauthor-edits.docx
@@ -136,704 +136,37 @@
         <w:pStyle w:val="Abstract"/>
       </w:pPr>
       <w:r>
-        <w:t>Extracellular</w:t>
-      </w:r>
-      <w:r>
-        <w:t xml:space="preserve"> </w:t>
-      </w:r>
-      <w:r>
-        <w:t>electron</w:t>
-      </w:r>
-      <w:r>
-        <w:t xml:space="preserve"> </w:t>
-      </w:r>
-      <w:r>
-        <w:t>transfer</w:t>
-      </w:r>
-      <w:r>
-        <w:t xml:space="preserve"> </w:t>
-      </w:r>
-      <w:r>
-        <w:t>(EET)</w:t>
-      </w:r>
-      <w:r>
-        <w:t xml:space="preserve"> </w:t>
-      </w:r>
-      <w:r>
-        <w:t>governs</w:t>
-      </w:r>
-      <w:r>
-        <w:t xml:space="preserve"> </w:t>
-      </w:r>
-      <w:r>
-        <w:t>the</w:t>
-      </w:r>
-      <w:r>
-        <w:t xml:space="preserve"> </w:t>
-      </w:r>
-      <w:r>
-        <w:t>metabolic</w:t>
-      </w:r>
-      <w:r>
-        <w:t xml:space="preserve"> </w:t>
-      </w:r>
-      <w:r>
-        <w:t>efficiency</w:t>
-      </w:r>
-      <w:r>
-        <w:t xml:space="preserve"> </w:t>
-      </w:r>
-      <w:r>
-        <w:t>and</w:t>
-      </w:r>
-      <w:r>
-        <w:t xml:space="preserve"> </w:t>
-      </w:r>
-      <w:r>
-        <w:t>power</w:t>
-      </w:r>
-      <w:r>
-        <w:t xml:space="preserve"> </w:t>
-      </w:r>
-      <w:r>
-        <w:t>generation</w:t>
-      </w:r>
-      <w:r>
-        <w:t xml:space="preserve"> </w:t>
-      </w:r>
-      <w:r>
-        <w:t>capability</w:t>
-      </w:r>
-      <w:r>
-        <w:t xml:space="preserve"> </w:t>
-      </w:r>
-      <w:r>
-        <w:t>of</w:t>
-      </w:r>
-      <w:r>
-        <w:t xml:space="preserve"> </w:t>
-      </w:r>
-      <w:r>
-        <w:t>electroactive</w:t>
-      </w:r>
-      <w:r>
-        <w:t xml:space="preserve"> </w:t>
-      </w:r>
-      <w:r>
-        <w:t>microorganisms</w:t>
-      </w:r>
-      <w:r>
-        <w:t xml:space="preserve"> </w:t>
-      </w:r>
-      <w:r>
-        <w:t>in</w:t>
-      </w:r>
-      <w:r>
-        <w:t xml:space="preserve"> </w:t>
-      </w:r>
-      <w:r>
-        <w:t>bioelectrochemical</w:t>
-      </w:r>
-      <w:r>
-        <w:t xml:space="preserve"> </w:t>
-      </w:r>
-      <w:r>
-        <w:t>systems.</w:t>
-      </w:r>
-      <w:r>
-        <w:t xml:space="preserve"> </w:t>
-      </w:r>
-      <w:r>
-        <w:t>Here,</w:t>
-      </w:r>
-      <w:r>
-        <w:t xml:space="preserve"> </w:t>
-      </w:r>
-      <w:r>
-        <w:t>we</w:t>
-      </w:r>
-      <w:r>
-        <w:t xml:space="preserve"> </w:t>
-      </w:r>
-      <w:r>
-        <w:t>demonstrate</w:t>
-      </w:r>
-      <w:r>
-        <w:t xml:space="preserve"> </w:t>
-      </w:r>
-      <w:r>
-        <w:t>that</w:t>
-      </w:r>
-      <w:r>
-        <w:t xml:space="preserve"> </w:t>
-      </w:r>
-      <w:r>
-        <w:t>surface</w:t>
-      </w:r>
-      <w:r>
-        <w:t xml:space="preserve"> </w:t>
-      </w:r>
-      <w:r>
-        <w:t>functionalization</w:t>
-      </w:r>
-      <w:r>
-        <w:t xml:space="preserve"> </w:t>
-      </w:r>
-      <w:r>
-        <w:t>of</w:t>
-      </w:r>
-      <w:r>
-        <w:t xml:space="preserve"> </w:t>
-      </w:r>
-      <w:r>
-        <w:t>carbon</w:t>
-      </w:r>
-      <w:r>
-        <w:t xml:space="preserve"> </w:t>
-      </w:r>
-      <w:r>
-        <w:t>cloth</w:t>
-      </w:r>
-      <w:r>
-        <w:t xml:space="preserve"> </w:t>
-      </w:r>
-      <w:r>
-        <w:t>anodes</w:t>
-      </w:r>
-      <w:r>
-        <w:t xml:space="preserve"> </w:t>
-      </w:r>
-      <w:r>
-        <w:t>with</w:t>
-      </w:r>
-      <w:r>
-        <w:t xml:space="preserve"> </w:t>
-      </w:r>
-      <w:r>
-        <w:t>hydrophilic</w:t>
-      </w:r>
-      <w:r>
-        <w:t xml:space="preserve"> </w:t>
-      </w:r>
-      <w:r>
-        <w:t>amine</w:t>
-      </w:r>
-      <w:r>
-        <w:t xml:space="preserve"> </w:t>
-      </w:r>
-      <w:r>
-        <w:t>groups</w:t>
-      </w:r>
-      <w:r>
-        <w:t xml:space="preserve"> </w:t>
-      </w:r>
-      <w:r>
-        <w:t>accelerates</w:t>
-      </w:r>
-      <w:r>
-        <w:t xml:space="preserve"> </w:t>
-      </w:r>
-      <w:r>
-        <w:t>colonization</w:t>
-      </w:r>
-      <w:r>
-        <w:t xml:space="preserve"> </w:t>
-      </w:r>
-      <w:r>
-        <w:t>and</w:t>
-      </w:r>
-      <w:r>
-        <w:t xml:space="preserve"> </w:t>
-      </w:r>
-      <w:r>
-        <w:t>interfacial</w:t>
-      </w:r>
-      <w:r>
-        <w:t xml:space="preserve"> </w:t>
-      </w:r>
-      <w:r>
-        <w:t>charge</w:t>
-      </w:r>
-      <w:r>
-        <w:t xml:space="preserve"> </w:t>
-      </w:r>
-      <w:r>
-        <w:t>transfer</w:t>
-      </w:r>
-      <w:r>
-        <w:t xml:space="preserve"> </w:t>
-      </w:r>
-      <w:r>
-        <w:t>of</w:t>
-      </w:r>
-      <w:r>
-        <w:t xml:space="preserve"> </w:t>
-      </w:r>
-      <w:r>
-        <w:t>Geobacter</w:t>
-      </w:r>
-      <w:r>
-        <w:t xml:space="preserve"> </w:t>
-      </w:r>
-      <w:r>
-        <w:t>sulfurreducens</w:t>
-      </w:r>
-      <w:r>
-        <w:t xml:space="preserve"> </w:t>
-      </w:r>
-      <w:r>
-        <w:t>biofilms.</w:t>
-      </w:r>
-      <w:r>
-        <w:t xml:space="preserve"> </w:t>
-      </w:r>
-      <w:r>
-        <w:t>Under</w:t>
-      </w:r>
-      <w:r>
-        <w:t xml:space="preserve"> </w:t>
-      </w:r>
-      <w:r>
-        <w:t>continuous</w:t>
-      </w:r>
-      <w:r>
-        <w:t xml:space="preserve"> </w:t>
-      </w:r>
-      <w:r>
-        <w:t>flow</w:t>
-      </w:r>
-      <w:r>
-        <w:t xml:space="preserve"> </w:t>
-      </w:r>
-      <w:r>
-        <w:t>conditions,</w:t>
-      </w:r>
-      <w:r>
-        <w:t xml:space="preserve"> </w:t>
-      </w:r>
-      <w:r>
-        <w:t>modified</w:t>
-      </w:r>
-      <w:r>
-        <w:t xml:space="preserve"> </w:t>
-      </w:r>
-      <w:r>
-        <w:t>anodes</w:t>
-      </w:r>
-      <w:r>
-        <w:t xml:space="preserve"> </w:t>
-      </w:r>
-      <w:r>
-        <w:t>achieved</w:t>
-      </w:r>
-      <w:r>
-        <w:t xml:space="preserve"> </w:t>
-      </w:r>
-      <w:r>
-        <w:t>a</w:t>
-      </w:r>
-      <w:r>
-        <w:t xml:space="preserve"> </w:t>
-      </w:r>
-      <w:r>
-        <w:t>maximum</w:t>
-      </w:r>
-      <w:r>
-        <w:t xml:space="preserve"> </w:t>
-      </w:r>
-      <w:r>
-        <w:t>current</w:t>
-      </w:r>
-      <w:r>
-        <w:t xml:space="preserve"> </w:t>
-      </w:r>
-      <w:r>
-        <w:t>density</w:t>
-      </w:r>
-      <w:r>
-        <w:t xml:space="preserve"> </w:t>
-      </w:r>
-      <w:r>
-        <w:t>of</w:t>
-      </w:r>
-      <w:r>
-        <w:t xml:space="preserve"> </w:t>
-      </w:r>
-      <w:del w:id="9000" w:author="Prof. Alice Smith" w:date="2026-10-01T18:58:30Z">
-        <w:r>
-          <w:delText>12.4</w:delText>
-        </w:r>
-      </w:del>
-      <w:ins w:id="9001" w:author="Prof. Alice Smith" w:date="2026-10-01T18:58:30Z">
-        <w:r>
-          <w:t>approximately</w:t>
-        </w:r>
-        <w:r>
-          <w:t xml:space="preserve"> </w:t>
-        </w:r>
-        <w:r>
-          <w:t>13.1</w:t>
-        </w:r>
-      </w:ins>
-      <w:r>
-        <w:t xml:space="preserve"> </w:t>
-      </w:r>
-      <w:r>
-        <w:t>A/m²,</w:t>
-      </w:r>
-      <w:r>
-        <w:t xml:space="preserve"> </w:t>
-      </w:r>
-      <w:r>
-        <w:t>representing</w:t>
-      </w:r>
-      <w:r>
-        <w:t xml:space="preserve"> </w:t>
-      </w:r>
-      <w:r>
-        <w:t>a</w:t>
-      </w:r>
-      <w:r>
-        <w:t xml:space="preserve"> </w:t>
-      </w:r>
-      <w:r>
-        <w:t>2.4-fold</w:t>
-      </w:r>
-      <w:r>
-        <w:t xml:space="preserve"> </w:t>
-      </w:r>
-      <w:r>
-        <w:t>enhancement</w:t>
-      </w:r>
-      <w:r>
-        <w:t xml:space="preserve"> </w:t>
-      </w:r>
-      <w:r>
-        <w:t>over</w:t>
-      </w:r>
-      <w:r>
-        <w:t xml:space="preserve"> </w:t>
-      </w:r>
-      <w:r>
-        <w:t>unmodified</w:t>
-      </w:r>
-      <w:r>
-        <w:t xml:space="preserve"> </w:t>
-      </w:r>
-      <w:r>
-        <w:t>controls.</w:t>
-      </w:r>
-      <w:r>
-        <w:t xml:space="preserve"> </w:t>
-      </w:r>
-      <w:r>
-        <w:t>Electrochemical</w:t>
-      </w:r>
-      <w:r>
-        <w:t xml:space="preserve"> </w:t>
-      </w:r>
-      <w:r>
-        <w:t>impedance</w:t>
-      </w:r>
-      <w:r>
-        <w:t xml:space="preserve"> </w:t>
-      </w:r>
-      <w:r>
-        <w:t>spectroscopy</w:t>
-      </w:r>
-      <w:r>
-        <w:t xml:space="preserve"> </w:t>
-      </w:r>
-      <w:r>
-        <w:t>revealed</w:t>
-      </w:r>
-      <w:r>
-        <w:t xml:space="preserve"> </w:t>
-      </w:r>
-      <w:r>
-        <w:t>a</w:t>
-      </w:r>
-      <w:r>
-        <w:t xml:space="preserve"> </w:t>
-      </w:r>
-      <w:r>
-        <w:t>68%</w:t>
-      </w:r>
-      <w:r>
-        <w:t xml:space="preserve"> </w:t>
-      </w:r>
-      <w:r>
-        <w:t>decrease</w:t>
-      </w:r>
-      <w:r>
-        <w:t xml:space="preserve"> </w:t>
-      </w:r>
-      <w:r>
-        <w:t>in</w:t>
-      </w:r>
-      <w:r>
-        <w:t xml:space="preserve"> </w:t>
-      </w:r>
-      <w:r>
-        <w:t>charge-transfer</w:t>
-      </w:r>
-      <w:r>
-        <w:t xml:space="preserve"> </w:t>
-      </w:r>
-      <w:r>
-        <w:t>resistance</w:t>
-      </w:r>
-      <w:r>
-        <w:t xml:space="preserve"> </w:t>
-      </w:r>
-      <w:r>
-        <w:t>across</w:t>
-      </w:r>
-      <w:r>
-        <w:t xml:space="preserve"> </w:t>
-      </w:r>
-      <w:r>
-        <w:t>the</w:t>
-      </w:r>
-      <w:r>
-        <w:t xml:space="preserve"> </w:t>
-      </w:r>
-      <w:r>
-        <w:t>biofilm-electrode</w:t>
-      </w:r>
-      <w:r>
-        <w:t xml:space="preserve"> </w:t>
-      </w:r>
-      <w:r>
-        <w:t>interface.</w:t>
-      </w:r>
-      <w:r>
-        <w:t xml:space="preserve"> </w:t>
-      </w:r>
-      <w:r>
-        <w:t>Chronoamperometric</w:t>
-      </w:r>
-      <w:r>
-        <w:t xml:space="preserve"> </w:t>
-      </w:r>
-      <w:r>
-        <w:t>analysis</w:t>
-      </w:r>
-      <w:r>
-        <w:t xml:space="preserve"> </w:t>
-      </w:r>
-      <w:r>
-        <w:t>and</w:t>
-      </w:r>
-      <w:r>
-        <w:t xml:space="preserve"> </w:t>
-      </w:r>
-      <w:r>
-        <w:t>cyclic</w:t>
-      </w:r>
-      <w:r>
-        <w:t xml:space="preserve"> </w:t>
-      </w:r>
-      <w:r>
-        <w:t>voltammetry</w:t>
-      </w:r>
-      <w:r>
-        <w:t xml:space="preserve"> </w:t>
-      </w:r>
-      <w:r>
-        <w:t>confirmed</w:t>
-      </w:r>
-      <w:r>
-        <w:t xml:space="preserve"> </w:t>
-      </w:r>
-      <w:r>
-        <w:t>that</w:t>
-      </w:r>
-      <w:r>
-        <w:t xml:space="preserve"> </w:t>
-      </w:r>
-      <w:r>
-        <w:t>accelerated</w:t>
-      </w:r>
-      <w:r>
-        <w:t xml:space="preserve"> </w:t>
-      </w:r>
-      <w:r>
-        <w:t>electron</w:t>
-      </w:r>
-      <w:r>
-        <w:t xml:space="preserve"> </w:t>
-      </w:r>
-      <w:r>
-        <w:t>transport</w:t>
-      </w:r>
-      <w:r>
-        <w:t xml:space="preserve"> </w:t>
-      </w:r>
-      <w:r>
-        <w:t>is</w:t>
-      </w:r>
-      <w:r>
-        <w:t xml:space="preserve"> </w:t>
-      </w:r>
-      <w:r>
-        <w:t>driven</w:t>
-      </w:r>
-      <w:r>
-        <w:t xml:space="preserve"> </w:t>
-      </w:r>
-      <w:r>
-        <w:t>by</w:t>
-      </w:r>
-      <w:r>
-        <w:t xml:space="preserve"> </w:t>
-      </w:r>
-      <w:r>
-        <w:t>enhanced</w:t>
-      </w:r>
-      <w:r>
-        <w:t xml:space="preserve"> </w:t>
-      </w:r>
-      <w:r>
-        <w:t>multi-heme</w:t>
-      </w:r>
-      <w:r>
-        <w:t xml:space="preserve"> </w:t>
-      </w:r>
-      <w:r>
-        <w:t>cytochrome</w:t>
-      </w:r>
-      <w:r>
-        <w:t xml:space="preserve"> </w:t>
-      </w:r>
-      <w:r>
-        <w:t>c</w:t>
-      </w:r>
-      <w:r>
-        <w:t xml:space="preserve"> </w:t>
-      </w:r>
-      <w:r>
-        <w:t>alignment</w:t>
-      </w:r>
-      <w:r>
-        <w:t xml:space="preserve"> </w:t>
-      </w:r>
-      <w:r>
-        <w:t>adjacent</w:t>
-      </w:r>
-      <w:r>
-        <w:t xml:space="preserve"> </w:t>
-      </w:r>
-      <w:r>
-        <w:t>to</w:t>
-      </w:r>
-      <w:r>
-        <w:t xml:space="preserve"> </w:t>
-      </w:r>
-      <w:r>
-        <w:t>the</w:t>
-      </w:r>
-      <w:r>
-        <w:t xml:space="preserve"> </w:t>
-      </w:r>
-      <w:r>
-        <w:t>electrode</w:t>
-      </w:r>
-      <w:r>
-        <w:t xml:space="preserve"> </w:t>
-      </w:r>
-      <w:r>
-        <w:t>surface.</w:t>
-      </w:r>
-      <w:r>
-        <w:t xml:space="preserve"> </w:t>
-      </w:r>
-      <w:r>
-        <w:t>These</w:t>
-      </w:r>
-      <w:r>
-        <w:t xml:space="preserve"> </w:t>
-      </w:r>
-      <w:r>
-        <w:t>findings</w:t>
-      </w:r>
-      <w:r>
-        <w:t xml:space="preserve"> </w:t>
-      </w:r>
-      <w:r>
-        <w:t>provide</w:t>
-      </w:r>
-      <w:r>
-        <w:t xml:space="preserve"> </w:t>
-      </w:r>
-      <w:r>
-        <w:t>a</w:t>
-      </w:r>
-      <w:r>
-        <w:t xml:space="preserve"> </w:t>
-      </w:r>
-      <w:r>
-        <w:t>mechanistic</w:t>
-      </w:r>
-      <w:r>
-        <w:t xml:space="preserve"> </w:t>
-      </w:r>
-      <w:r>
-        <w:t>framework</w:t>
-      </w:r>
-      <w:r>
-        <w:t xml:space="preserve"> </w:t>
-      </w:r>
-      <w:r>
-        <w:t>for</w:t>
-      </w:r>
-      <w:r>
-        <w:t xml:space="preserve"> </w:t>
-      </w:r>
-      <w:r>
-        <w:t>engineering</w:t>
-      </w:r>
-      <w:r>
-        <w:t xml:space="preserve"> </w:t>
-      </w:r>
-      <w:r>
-        <w:t>high-performance</w:t>
-      </w:r>
-      <w:r>
-        <w:t xml:space="preserve"> </w:t>
-      </w:r>
-      <w:r>
-        <w:t>bioelectrochemical</w:t>
-      </w:r>
-      <w:r>
-        <w:t xml:space="preserve"> </w:t>
-      </w:r>
-      <w:r>
-        <w:t>interfaces</w:t>
-      </w:r>
-      <w:r>
-        <w:t xml:space="preserve"> </w:t>
-      </w:r>
-      <w:r>
-        <w:t>in</w:t>
-      </w:r>
-      <w:r>
-        <w:t xml:space="preserve"> </w:t>
-      </w:r>
-      <w:r>
-        <w:t>wastewater</w:t>
-      </w:r>
-      <w:r>
-        <w:t xml:space="preserve"> </w:t>
-      </w:r>
-      <w:r>
-        <w:t>energy</w:t>
-      </w:r>
-      <w:r>
-        <w:t xml:space="preserve"> </w:t>
-      </w:r>
-      <w:r>
-        <w:t>recovery.</w:t>
+        <w:t xml:space="preserve">Extracellular electron transfer (EET) governs the metabolic efficiency and power generation capability of electroactive microorganisms in bioelectrochemical systems.</w:t>
+      </w:r>
+      <w:r>
+        <w:t xml:space="preserve"> </w:t>
+      </w:r>
+      <w:r>
+        <w:t xml:space="preserve">Here, we demonstrate that surface functionalization of carbon cloth anodes with hydrophilic amine groups accelerates colonization and interfacial charge transfer of Geobacter sulfurreducens biofilms.</w:t>
+      </w:r>
+      <w:r>
+        <w:t xml:space="preserve"> </w:t>
+      </w:r>
+      <w:r>
+        <w:t xml:space="preserve">Under continuous flow conditions, modified anodes achieved a maximum current density of 12.4 A/m², representing a 2.4-fold enhancement over unmodified controls.</w:t>
+      </w:r>
+      <w:r>
+        <w:t xml:space="preserve"> </w:t>
+      </w:r>
+      <w:r>
+        <w:t xml:space="preserve">Electrochemical impedance spectroscopy revealed a 68% decrease in charge-transfer resistance across the biofilm-electrode interface.</w:t>
+      </w:r>
+      <w:r>
+        <w:t xml:space="preserve"> </w:t>
+      </w:r>
+      <w:r>
+        <w:t xml:space="preserve">Chronoamperometric analysis and cyclic voltammetry confirmed that accelerated electron transport is driven by enhanced multi-heme cytochrome c alignment adjacent to the electrode surface.</w:t>
+      </w:r>
+      <w:r>
+        <w:t xml:space="preserve"> </w:t>
+      </w:r>
+      <w:r>
+        <w:t xml:space="preserve">These findings provide a mechanistic framework for engineering high-performance bioelectrochemical interfaces in wastewater energy recovery.</w:t>
       </w:r>
     </w:p>
     <w:bookmarkStart w:id="9" w:name="introduction"/>
@@ -1079,7 +412,7 @@
       <w:r>
         <w:t>conducted</w:t>
       </w:r>
-      <w:ins w:id="9002" w:author="Prof. Alice Smith" w:date="2026-10-01T18:58:30Z">
+      <w:ins w:id="9000" w:author="Synthetic reviewer" w:date="2026-10-02T00:00:00Z">
         <w:r>
           <w:t xml:space="preserve"> </w:t>
         </w:r>
@@ -2709,7 +2042,109 @@
         <w:pStyle w:val="FirstParagraph"/>
       </w:pPr>
       <w:r>
-        <w:t xml:space="preserve">This study demonstrates that targeted surface functionalization of carbon cloth anodes substantially enhances extracellular electron transfer kinetics in</w:t>
+        <w:t>This</w:t>
+      </w:r>
+      <w:r>
+        <w:t xml:space="preserve"> </w:t>
+      </w:r>
+      <w:r>
+        <w:t>study</w:t>
+      </w:r>
+      <w:r>
+        <w:t xml:space="preserve"> </w:t>
+      </w:r>
+      <w:r>
+        <w:t>demonstrates</w:t>
+      </w:r>
+      <w:r>
+        <w:t xml:space="preserve"> </w:t>
+      </w:r>
+      <w:r>
+        <w:t>that</w:t>
+      </w:r>
+      <w:r>
+        <w:t xml:space="preserve"> </w:t>
+      </w:r>
+      <w:r>
+        <w:t>targeted</w:t>
+      </w:r>
+      <w:r>
+        <w:t xml:space="preserve"> </w:t>
+      </w:r>
+      <w:r>
+        <w:t>surface</w:t>
+      </w:r>
+      <w:r>
+        <w:t xml:space="preserve"> </w:t>
+      </w:r>
+      <w:r>
+        <w:t>functionalization</w:t>
+      </w:r>
+      <w:r>
+        <w:t xml:space="preserve"> </w:t>
+      </w:r>
+      <w:r>
+        <w:t>of</w:t>
+      </w:r>
+      <w:r>
+        <w:t xml:space="preserve"> </w:t>
+      </w:r>
+      <w:r>
+        <w:t>carbon</w:t>
+      </w:r>
+      <w:r>
+        <w:t xml:space="preserve"> </w:t>
+      </w:r>
+      <w:r>
+        <w:t>cloth</w:t>
+      </w:r>
+      <w:r>
+        <w:t xml:space="preserve"> </w:t>
+      </w:r>
+      <w:r>
+        <w:t>anodes</w:t>
+      </w:r>
+      <w:r>
+        <w:t xml:space="preserve"> </w:t>
+      </w:r>
+      <w:r>
+        <w:t>substantially</w:t>
+      </w:r>
+      <w:r>
+        <w:t xml:space="preserve"> </w:t>
+      </w:r>
+      <w:r>
+        <w:t>enhances</w:t>
+      </w:r>
+      <w:r>
+        <w:t xml:space="preserve"> </w:t>
+      </w:r>
+      <w:r>
+        <w:t>extracellular</w:t>
+      </w:r>
+      <w:r>
+        <w:t xml:space="preserve"> </w:t>
+      </w:r>
+      <w:r>
+        <w:t>electron</w:t>
+      </w:r>
+      <w:r>
+        <w:t xml:space="preserve"> </w:t>
+      </w:r>
+      <w:r>
+        <w:t>transfer</w:t>
+      </w:r>
+      <w:r>
+        <w:t xml:space="preserve"> </w:t>
+      </w:r>
+      <w:r>
+        <w:t>kinetics</w:t>
+      </w:r>
+      <w:r>
+        <w:t xml:space="preserve"> </w:t>
+      </w:r>
+      <w:r>
+        <w:t>in</w:t>
       </w:r>
       <w:r>
         <w:t xml:space="preserve"> </w:t>
@@ -2719,25 +2154,286 @@
           <w:i/>
           <w:iCs/>
         </w:rPr>
-        <w:t xml:space="preserve">G. sulfurreducens</w:t>
-      </w:r>
-      <w:r>
-        <w:t xml:space="preserve"> </w:t>
-      </w:r>
-      <w:r>
-        <w:t xml:space="preserve">biofilms.</w:t>
-      </w:r>
-      <w:r>
-        <w:t xml:space="preserve"> </w:t>
-      </w:r>
-      <w:r>
-        <w:t xml:space="preserve">Under continuous flow conditions, functionalized electrodes sustained a peak current density of 12.4 A/m² with a marked reduction in interfacial charge-transfer resistance.</w:t>
-      </w:r>
-      <w:r>
-        <w:t xml:space="preserve"> </w:t>
-      </w:r>
-      <w:r>
-        <w:t xml:space="preserve">These quantitative insights provide actionable design criteria for scaling bioelectrochemical reactors in practical wastewater treatment and resource recovery applications.</w:t>
+        <w:t>G.</w:t>
+      </w:r>
+      <w:r>
+        <w:rPr>
+          <w:i/>
+          <w:iCs/>
+        </w:rPr>
+        <w:t xml:space="preserve"> </w:t>
+      </w:r>
+      <w:r>
+        <w:rPr>
+          <w:i/>
+          <w:iCs/>
+        </w:rPr>
+        <w:t>sulfurreducens</w:t>
+      </w:r>
+      <w:r>
+        <w:t xml:space="preserve"> </w:t>
+      </w:r>
+      <w:r>
+        <w:t>biofilms.</w:t>
+      </w:r>
+      <w:r>
+        <w:t xml:space="preserve"> </w:t>
+      </w:r>
+      <w:r>
+        <w:t>Under</w:t>
+      </w:r>
+      <w:r>
+        <w:t xml:space="preserve"> </w:t>
+      </w:r>
+      <w:r>
+        <w:t>continuous</w:t>
+      </w:r>
+      <w:r>
+        <w:t xml:space="preserve"> </w:t>
+      </w:r>
+      <w:r>
+        <w:t>flow</w:t>
+      </w:r>
+      <w:r>
+        <w:t xml:space="preserve"> </w:t>
+      </w:r>
+      <w:r>
+        <w:t>conditions,</w:t>
+      </w:r>
+      <w:r>
+        <w:t xml:space="preserve"> </w:t>
+      </w:r>
+      <w:r>
+        <w:t>functionalized</w:t>
+      </w:r>
+      <w:r>
+        <w:t xml:space="preserve"> </w:t>
+      </w:r>
+      <w:r>
+        <w:t>electrodes</w:t>
+      </w:r>
+      <w:r>
+        <w:t xml:space="preserve"> </w:t>
+      </w:r>
+      <w:r>
+        <w:t>sustained</w:t>
+      </w:r>
+      <w:r>
+        <w:t xml:space="preserve"> </w:t>
+      </w:r>
+      <w:r>
+        <w:t>a</w:t>
+      </w:r>
+      <w:r>
+        <w:t xml:space="preserve"> </w:t>
+      </w:r>
+      <w:r>
+        <w:t>peak</w:t>
+      </w:r>
+      <w:r>
+        <w:t xml:space="preserve"> </w:t>
+      </w:r>
+      <w:r>
+        <w:t>current</w:t>
+      </w:r>
+      <w:r>
+        <w:t xml:space="preserve"> </w:t>
+      </w:r>
+      <w:r>
+        <w:t>density</w:t>
+      </w:r>
+      <w:r>
+        <w:t xml:space="preserve"> </w:t>
+      </w:r>
+      <w:r>
+        <w:t>of</w:t>
+      </w:r>
+      <w:r>
+        <w:t xml:space="preserve"> </w:t>
+      </w:r>
+      <w:del w:id="9001" w:author="Synthetic reviewer" w:date="2026-10-02T00:00:00Z">
+        <w:r>
+          <w:delText>12.4</w:delText>
+        </w:r>
+      </w:del>
+      <w:ins w:id="9002" w:author="Synthetic reviewer" w:date="2026-10-02T00:00:00Z">
+        <w:r>
+          <w:t>approximately</w:t>
+        </w:r>
+        <w:r>
+          <w:t xml:space="preserve"> </w:t>
+        </w:r>
+        <w:r>
+          <w:t>13.1</w:t>
+        </w:r>
+      </w:ins>
+      <w:r>
+        <w:t xml:space="preserve"> </w:t>
+      </w:r>
+      <w:r>
+        <w:t>A/m²</w:t>
+      </w:r>
+      <w:r>
+        <w:t xml:space="preserve"> </w:t>
+      </w:r>
+      <w:r>
+        <w:t>with</w:t>
+      </w:r>
+      <w:r>
+        <w:t xml:space="preserve"> </w:t>
+      </w:r>
+      <w:r>
+        <w:t>a</w:t>
+      </w:r>
+      <w:r>
+        <w:t xml:space="preserve"> </w:t>
+      </w:r>
+      <w:r>
+        <w:t>marked</w:t>
+      </w:r>
+      <w:r>
+        <w:t xml:space="preserve"> </w:t>
+      </w:r>
+      <w:r>
+        <w:t>reduction</w:t>
+      </w:r>
+      <w:r>
+        <w:t xml:space="preserve"> </w:t>
+      </w:r>
+      <w:r>
+        <w:t>in</w:t>
+      </w:r>
+      <w:r>
+        <w:t xml:space="preserve"> </w:t>
+      </w:r>
+      <w:r>
+        <w:t>interfacial</w:t>
+      </w:r>
+      <w:r>
+        <w:t xml:space="preserve"> </w:t>
+      </w:r>
+      <w:r>
+        <w:t>charge-transfer</w:t>
+      </w:r>
+      <w:r>
+        <w:t xml:space="preserve"> </w:t>
+      </w:r>
+      <w:r>
+        <w:t>resistance.</w:t>
+      </w:r>
+      <w:r>
+        <w:t xml:space="preserve"> </w:t>
+      </w:r>
+      <w:r>
+        <w:t>These</w:t>
+      </w:r>
+      <w:r>
+        <w:t xml:space="preserve"> </w:t>
+      </w:r>
+      <w:r>
+        <w:t>quantitative</w:t>
+      </w:r>
+      <w:r>
+        <w:t xml:space="preserve"> </w:t>
+      </w:r>
+      <w:r>
+        <w:t>insights</w:t>
+      </w:r>
+      <w:r>
+        <w:t xml:space="preserve"> </w:t>
+      </w:r>
+      <w:r>
+        <w:t>provide</w:t>
+      </w:r>
+      <w:r>
+        <w:t xml:space="preserve"> </w:t>
+      </w:r>
+      <w:r>
+        <w:t>actionable</w:t>
+      </w:r>
+      <w:r>
+        <w:t xml:space="preserve"> </w:t>
+      </w:r>
+      <w:r>
+        <w:t>design</w:t>
+      </w:r>
+      <w:r>
+        <w:t xml:space="preserve"> </w:t>
+      </w:r>
+      <w:r>
+        <w:t>criteria</w:t>
+      </w:r>
+      <w:r>
+        <w:t xml:space="preserve"> </w:t>
+      </w:r>
+      <w:r>
+        <w:t>for</w:t>
+      </w:r>
+      <w:r>
+        <w:t xml:space="preserve"> </w:t>
+      </w:r>
+      <w:r>
+        <w:t>scaling</w:t>
+      </w:r>
+      <w:r>
+        <w:t xml:space="preserve"> </w:t>
+      </w:r>
+      <w:r>
+        <w:t>bioelectrochemical</w:t>
+      </w:r>
+      <w:r>
+        <w:t xml:space="preserve"> </w:t>
+      </w:r>
+      <w:r>
+        <w:t>reactors</w:t>
+      </w:r>
+      <w:r>
+        <w:t xml:space="preserve"> </w:t>
+      </w:r>
+      <w:r>
+        <w:t>in</w:t>
+      </w:r>
+      <w:r>
+        <w:t xml:space="preserve"> </w:t>
+      </w:r>
+      <w:r>
+        <w:t>practical</w:t>
+      </w:r>
+      <w:r>
+        <w:t xml:space="preserve"> </w:t>
+      </w:r>
+      <w:r>
+        <w:t>wastewater</w:t>
+      </w:r>
+      <w:r>
+        <w:t xml:space="preserve"> </w:t>
+      </w:r>
+      <w:r>
+        <w:t>treatment</w:t>
+      </w:r>
+      <w:r>
+        <w:t xml:space="preserve"> </w:t>
+      </w:r>
+      <w:r>
+        <w:t>and</w:t>
+      </w:r>
+      <w:r>
+        <w:t xml:space="preserve"> </w:t>
+      </w:r>
+      <w:r>
+        <w:t>resource</w:t>
+      </w:r>
+      <w:r>
+        <w:t xml:space="preserve"> </w:t>
+      </w:r>
+      <w:r>
+        <w:t>recovery</w:t>
+      </w:r>
+      <w:r>
+        <w:t xml:space="preserve"> </w:t>
+      </w:r>
+      <w:r>
+        <w:t>applications.</w:t>
       </w:r>
     </w:p>
     <w:bookmarkStart w:id="32" w:name="refs"/>

</xml_diff>